<commit_message>
checkpoint before folder rename
</commit_message>
<xml_diff>
--- a/docs/qs_framework_Examples.docx
+++ b/docs/qs_framework_Examples.docx
@@ -220,6 +220,215 @@
           <w:szCs w:val="21"/>
         </w:rPr>
         <w:t xml:space="preserve">On the cluster the path is wherever you synced the folder to; substitute it everywhere below.</w:t>
+      </w:r>
+    </w:p>
+    <w:p>
+      <w:pPr>
+        <w:pStyle w:val="Heading2"/>
+        <w:spacing w:after="60" w:before="160"/>
+      </w:pPr>
+      <w:r>
+        <w:rPr>
+          <w:rFonts w:ascii="Calibri" w:cs="Calibri" w:eastAsia="Calibri" w:hAnsi="Calibri"/>
+          <w:b/>
+          <w:bCs/>
+          <w:color w:val="2E5496"/>
+          <w:sz w:val="22"/>
+          <w:szCs w:val="22"/>
+        </w:rPr>
+        <w:t xml:space="preserve">What does label 3 mean?</w:t>
+      </w:r>
+    </w:p>
+    <w:p>
+      <w:pPr>
+        <w:spacing w:after="90" w:line="252"/>
+      </w:pPr>
+      <w:r>
+        <w:rPr>
+          <w:rFonts w:ascii="Calibri" w:cs="Calibri" w:eastAsia="Calibri" w:hAnsi="Calibri"/>
+          <w:sz w:val="21"/>
+          <w:szCs w:val="21"/>
+        </w:rPr>
+        <w:t xml:space="preserve">Every coded value the framework writes -- labels, flags, metrics, point-list columns, configuration names, file patterns, units -- is printed by one command, and written up in </w:t>
+      </w:r>
+      <w:r>
+        <w:rPr>
+          <w:rFonts w:ascii="Consolas" w:cs="Consolas" w:eastAsia="Consolas" w:hAnsi="Consolas"/>
+          <w:sz w:val="17"/>
+          <w:szCs w:val="17"/>
+        </w:rPr>
+        <w:t xml:space="preserve">docs/CODES.md</w:t>
+      </w:r>
+      <w:r>
+        <w:rPr>
+          <w:rFonts w:ascii="Calibri" w:cs="Calibri" w:eastAsia="Calibri" w:hAnsi="Calibri"/>
+          <w:sz w:val="21"/>
+          <w:szCs w:val="21"/>
+        </w:rPr>
+        <w:t xml:space="preserve">:</w:t>
+      </w:r>
+    </w:p>
+    <w:p>
+      <w:pPr>
+        <w:shd w:fill="F2F2F2" w:val="clear"/>
+        <w:spacing w:after="0" w:before="50" w:line="228"/>
+        <w:ind w:left="200"/>
+      </w:pPr>
+      <w:r>
+        <w:rPr>
+          <w:rFonts w:ascii="Consolas" w:cs="Consolas" w:eastAsia="Consolas" w:hAnsi="Consolas"/>
+          <w:sz w:val="17"/>
+          <w:szCs w:val="17"/>
+        </w:rPr>
+        <w:t xml:space="preserve">&gt;&gt; qs_codes                % everything</w:t>
+      </w:r>
+    </w:p>
+    <w:p>
+      <w:pPr>
+        <w:shd w:fill="F2F2F2" w:val="clear"/>
+        <w:spacing w:after="0" w:before="0" w:line="228"/>
+        <w:ind w:left="200"/>
+      </w:pPr>
+      <w:r>
+        <w:rPr>
+          <w:rFonts w:ascii="Consolas" w:cs="Consolas" w:eastAsia="Consolas" w:hAnsi="Consolas"/>
+          <w:sz w:val="17"/>
+          <w:szCs w:val="17"/>
+        </w:rPr>
+        <w:t xml:space="preserve">&gt;&gt; qs_codes('labels')      % one section</w:t>
+      </w:r>
+    </w:p>
+    <w:p>
+      <w:pPr>
+        <w:shd w:fill="F2F2F2" w:val="clear"/>
+        <w:spacing w:after="120" w:before="0" w:line="228"/>
+        <w:ind w:left="200"/>
+      </w:pPr>
+      <w:r>
+        <w:rPr>
+          <w:rFonts w:ascii="Consolas" w:cs="Consolas" w:eastAsia="Consolas" w:hAnsi="Consolas"/>
+          <w:sz w:val="17"/>
+          <w:szCs w:val="17"/>
+        </w:rPr>
+        <w:t xml:space="preserve">                           % labels flags metrics points config files units</w:t>
+      </w:r>
+    </w:p>
+    <w:p>
+      <w:pPr>
+        <w:shd w:fill="EAF3E7" w:val="clear"/>
+        <w:spacing w:after="0" w:before="50" w:line="228"/>
+        <w:ind w:left="200"/>
+      </w:pPr>
+      <w:r>
+        <w:rPr>
+          <w:rFonts w:ascii="Consolas" w:cs="Consolas" w:eastAsia="Consolas" w:hAnsi="Consolas"/>
+          <w:sz w:val="17"/>
+          <w:szCs w:val="17"/>
+        </w:rPr>
+        <w:t xml:space="preserve">  code   name          test</w:t>
+      </w:r>
+    </w:p>
+    <w:p>
+      <w:pPr>
+        <w:shd w:fill="EAF3E7" w:val="clear"/>
+        <w:spacing w:after="0" w:before="0" w:line="228"/>
+        <w:ind w:left="200"/>
+      </w:pPr>
+      <w:r>
+        <w:rPr>
+          <w:rFonts w:ascii="Consolas" w:cs="Consolas" w:eastAsia="Consolas" w:hAnsi="Consolas"/>
+          <w:sz w:val="17"/>
+          <w:szCs w:val="17"/>
+        </w:rPr>
+        <w:t xml:space="preserve">  ------------------------------------------------------------------</w:t>
+      </w:r>
+    </w:p>
+    <w:p>
+      <w:pPr>
+        <w:shd w:fill="EAF3E7" w:val="clear"/>
+        <w:spacing w:after="0" w:before="0" w:line="228"/>
+        <w:ind w:left="200"/>
+      </w:pPr>
+      <w:r>
+        <w:rPr>
+          <w:rFonts w:ascii="Consolas" w:cs="Consolas" w:eastAsia="Consolas" w:hAnsi="Consolas"/>
+          <w:sz w:val="17"/>
+          <w:szCs w:val="17"/>
+        </w:rPr>
+        <w:t xml:space="preserve">  0      unknown       spectrum could not be formed (record too short)</w:t>
+      </w:r>
+    </w:p>
+    <w:p>
+      <w:pPr>
+        <w:shd w:fill="EAF3E7" w:val="clear"/>
+        <w:spacing w:after="0" w:before="0" w:line="228"/>
+        <w:ind w:left="200"/>
+      </w:pPr>
+      <w:r>
+        <w:rPr>
+          <w:rFonts w:ascii="Consolas" w:cs="Consolas" w:eastAsia="Consolas" w:hAnsi="Consolas"/>
+          <w:sz w:val="17"/>
+          <w:szCs w:val="17"/>
+        </w:rPr>
+        <w:t xml:space="preserve">  1      static        window amplitude &lt; classify.amp_tol_wh</w:t>
+      </w:r>
+    </w:p>
+    <w:p>
+      <w:pPr>
+        <w:shd w:fill="EAF3E7" w:val="clear"/>
+        <w:spacing w:after="0" w:before="0" w:line="228"/>
+        <w:ind w:left="200"/>
+      </w:pPr>
+      <w:r>
+        <w:rPr>
+          <w:rFonts w:ascii="Consolas" w:cs="Consolas" w:eastAsia="Consolas" w:hAnsi="Consolas"/>
+          <w:sz w:val="17"/>
+          <w:szCs w:val="17"/>
+        </w:rPr>
+        <w:t xml:space="preserve">  2      LCO           above tolerance AND pfrac &gt;= peak_power_frac</w:t>
+      </w:r>
+    </w:p>
+    <w:p>
+      <w:pPr>
+        <w:shd w:fill="EAF3E7" w:val="clear"/>
+        <w:spacing w:after="0" w:before="0" w:line="228"/>
+        <w:ind w:left="200"/>
+      </w:pPr>
+      <w:r>
+        <w:rPr>
+          <w:rFonts w:ascii="Consolas" w:cs="Consolas" w:eastAsia="Consolas" w:hAnsi="Consolas"/>
+          <w:sz w:val="17"/>
+          <w:szCs w:val="17"/>
+        </w:rPr>
+        <w:t xml:space="preserve">  3      broadband     above tolerance, no dominant tone</w:t>
+      </w:r>
+    </w:p>
+    <w:p>
+      <w:pPr>
+        <w:shd w:fill="EAF3E7" w:val="clear"/>
+        <w:spacing w:after="120" w:before="0" w:line="228"/>
+        <w:ind w:left="200"/>
+      </w:pPr>
+      <w:r>
+        <w:rPr>
+          <w:rFonts w:ascii="Consolas" w:cs="Consolas" w:eastAsia="Consolas" w:hAnsi="Consolas"/>
+          <w:sz w:val="17"/>
+          <w:szCs w:val="17"/>
+        </w:rPr>
+        <w:t xml:space="preserve">  4      divergent     whole record: amplitude grows by &gt; growth_tol</w:t>
+      </w:r>
+    </w:p>
+    <w:p>
+      <w:pPr>
+        <w:spacing w:after="90" w:line="252"/>
+      </w:pPr>
+      <w:r>
+        <w:rPr>
+          <w:rFonts w:ascii="Calibri" w:cs="Calibri" w:eastAsia="Calibri" w:hAnsi="Calibri"/>
+          <w:sz w:val="21"/>
+          <w:szCs w:val="21"/>
+        </w:rPr>
+        <w:t xml:space="preserve">There is no label for "nonstationary" -- that is a flag. A run can be static AND nonstationary: one says what the panel did, the other says whether to believe it.</w:t>
       </w:r>
     </w:p>
     <w:p>
@@ -820,7 +1029,7 @@
           <w:sz w:val="21"/>
           <w:szCs w:val="21"/>
         </w:rPr>
-        <w:t xml:space="preserve">This is the check that matters. It re-runs points from the original case-1 map through the new code and requires every metric to agree to one part in a million.</w:t>
+        <w:t xml:space="preserve">This is the check that matters. It re-runs points from the original case-1 map through the new code and requires every metric to agree to one part in a million — with two sensible exceptions, explained below the command.</w:t>
       </w:r>
     </w:p>
     <w:p>
@@ -848,7 +1057,7 @@
           <w:sz w:val="21"/>
           <w:szCs w:val="21"/>
         </w:rPr>
-        <w:t xml:space="preserve">About three minutes per point, three points by default. Expected:</w:t>
+        <w:t xml:space="preserve">About three minutes per point, four points by default (one from the static region, three that actually move). Expected:</w:t>
       </w:r>
     </w:p>
     <w:p>
@@ -863,7 +1072,7 @@
           <w:sz w:val="17"/>
           <w:szCs w:val="17"/>
         </w:rPr>
-        <w:t xml:space="preserve">    [1/3] p_c = 50.50 kPa, dT = 6.000 K ... 2.8 min</w:t>
+        <w:t xml:space="preserve">    [2/4] p_c = 50.50 kPa, dT = 6.000 K  (map amp 0.00413 w/h) ... 2.8 min</w:t>
       </w:r>
     </w:p>
     <w:p>
@@ -878,7 +1087,7 @@
           <w:sz w:val="17"/>
           <w:szCs w:val="17"/>
         </w:rPr>
-        <w:t xml:space="preserve">          Amp_wh       0.00412718  (match, 3.1e-14)</w:t>
+        <w:t xml:space="preserve">          Amp_wh       0.00412718   (match, 3.1e-14)</w:t>
       </w:r>
     </w:p>
     <w:p>
@@ -893,7 +1102,22 @@
           <w:sz w:val="17"/>
           <w:szCs w:val="17"/>
         </w:rPr>
-        <w:t xml:space="preserve">          Freq              263.0  (match, 0.0e+00)</w:t>
+        <w:t xml:space="preserve">          MeanPeak      0.68416866   (match, 0.0e+00)</w:t>
+      </w:r>
+    </w:p>
+    <w:p>
+      <w:pPr>
+        <w:shd w:fill="EAF3E7" w:val="clear"/>
+        <w:spacing w:after="0" w:before="0" w:line="228"/>
+        <w:ind w:left="200"/>
+      </w:pPr>
+      <w:r>
+        <w:rPr>
+          <w:rFonts w:ascii="Consolas" w:cs="Consolas" w:eastAsia="Consolas" w:hAnsi="Consolas"/>
+          <w:sz w:val="17"/>
+          <w:szCs w:val="17"/>
+        </w:rPr>
+        <w:t xml:space="preserve">          Freq               263.0   (not compared: motion too small for a frequency)</w:t>
       </w:r>
     </w:p>
     <w:p>
@@ -923,7 +1147,7 @@
           <w:sz w:val="17"/>
           <w:szCs w:val="17"/>
         </w:rPr>
-        <w:t xml:space="preserve">    every metric reproduces the original map to 1e-06</w:t>
+        <w:t xml:space="preserve">    18 matched to 1e-06, 4 below the floor (not compared), 0 DIFFER</w:t>
       </w:r>
     </w:p>
     <w:p>
@@ -936,6 +1160,330 @@
           <w:sz w:val="21"/>
           <w:szCs w:val="21"/>
         </w:rPr>
+        <w:t xml:space="preserve">Two comparisons are deliberately skipped rather than forced:</w:t>
+      </w:r>
+    </w:p>
+    <w:p>
+      <w:pPr>
+        <w:pStyle w:val="ListParagraph"/>
+        <w:numPr>
+          <w:ilvl w:val="0"/>
+          <w:numId w:val="2"/>
+        </w:numPr>
+        <w:spacing w:after="55" w:line="252"/>
+      </w:pPr>
+      <w:r>
+        <w:rPr>
+          <w:rFonts w:ascii="Calibri" w:cs="Calibri" w:eastAsia="Calibri" w:hAnsi="Calibri"/>
+          <w:sz w:val="21"/>
+          <w:szCs w:val="21"/>
+        </w:rPr>
+        <w:t xml:space="preserve">Quantities below an absolute floor. Most of the map is a panel sitting still, where the amplitude is around 1e-10 panel thicknesses and the peak deflection is 1e-8 mm. Two numbers that small cannot agree to one part in a million — that is roundoff, and roundoff is not reproducible across MATLAB releases. Below the floor both values are simply reported as negligible.</w:t>
+      </w:r>
+    </w:p>
+    <w:p>
+      <w:pPr>
+        <w:pStyle w:val="ListParagraph"/>
+        <w:numPr>
+          <w:ilvl w:val="0"/>
+          <w:numId w:val="2"/>
+        </w:numPr>
+        <w:spacing w:after="55" w:line="252"/>
+      </w:pPr>
+      <w:r>
+        <w:rPr>
+          <w:rFonts w:ascii="Calibri" w:cs="Calibri" w:eastAsia="Calibri" w:hAnsi="Calibri"/>
+          <w:sz w:val="21"/>
+          <w:szCs w:val="21"/>
+        </w:rPr>
+        <w:t xml:space="preserve">Frequency in a record with no oscillation. The dominant frequency is the argmax of a spectrum; with nothing oscillating it is the argmax of noise and can land anywhere. It is compared only when the motion exceeds 0.01 panel thicknesses.</w:t>
+      </w:r>
+    </w:p>
+    <w:p>
+      <w:pPr>
+        <w:pStyle w:val="Heading2"/>
+        <w:spacing w:after="60" w:before="160"/>
+      </w:pPr>
+      <w:r>
+        <w:rPr>
+          <w:rFonts w:ascii="Calibri" w:cs="Calibri" w:eastAsia="Calibri" w:hAnsi="Calibri"/>
+          <w:b/>
+          <w:bCs/>
+          <w:color w:val="2E5496"/>
+          <w:sz w:val="22"/>
+          <w:szCs w:val="22"/>
+        </w:rPr>
+        <w:t xml:space="preserve">B1. When a point still differs: t03b</w:t>
+      </w:r>
+    </w:p>
+    <w:p>
+      <w:pPr>
+        <w:spacing w:after="90" w:line="252"/>
+      </w:pPr>
+      <w:r>
+        <w:rPr>
+          <w:rFonts w:ascii="Calibri" w:cs="Calibri" w:eastAsia="Calibri" w:hAnsi="Calibri"/>
+          <w:sz w:val="21"/>
+          <w:szCs w:val="21"/>
+        </w:rPr>
+        <w:t xml:space="preserve">A point that genuinely differs is not automatically a bug. It may sit near a regime boundary, where two runs that started identically separate later because the integrator took a slightly different path — a different MATLAB release is enough to do that. Summary numbers cannot tell that apart from a setting that drifted. This does:</w:t>
+      </w:r>
+    </w:p>
+    <w:p>
+      <w:pPr>
+        <w:shd w:fill="F2F2F2" w:val="clear"/>
+        <w:spacing w:after="120" w:before="50" w:line="228"/>
+        <w:ind w:left="200"/>
+      </w:pPr>
+      <w:r>
+        <w:rPr>
+          <w:rFonts w:ascii="Consolas" w:cs="Consolas" w:eastAsia="Consolas" w:hAnsi="Consolas"/>
+          <w:sz w:val="17"/>
+          <w:szCs w:val="17"/>
+        </w:rPr>
+        <w:t xml:space="preserve">&gt;&gt; t03b_attribute(53.20, 14.050)      % the p_c and dT that t03 reported</w:t>
+      </w:r>
+    </w:p>
+    <w:p>
+      <w:pPr>
+        <w:spacing w:after="90" w:line="252"/>
+      </w:pPr>
+      <w:r>
+        <w:rPr>
+          <w:rFonts w:ascii="Calibri" w:cs="Calibri" w:eastAsia="Calibri" w:hAnsi="Calibri"/>
+          <w:sz w:val="21"/>
+          <w:szCs w:val="21"/>
+        </w:rPr>
+        <w:t xml:space="preserve">It runs that one operating point three ways — the history stored in the original map, the ORIGINAL driver code re-run now in your MATLAB, and the framework — and reports when each pair of histories separates:</w:t>
+      </w:r>
+    </w:p>
+    <w:p>
+      <w:pPr>
+        <w:shd w:fill="EAF3E7" w:val="clear"/>
+        <w:spacing w:after="0" w:before="50" w:line="228"/>
+        <w:ind w:left="200"/>
+      </w:pPr>
+      <w:r>
+        <w:rPr>
+          <w:rFonts w:ascii="Consolas" w:cs="Consolas" w:eastAsia="Consolas" w:hAnsi="Consolas"/>
+          <w:sz w:val="17"/>
+          <w:szCs w:val="17"/>
+        </w:rPr>
+        <w:t xml:space="preserve">  stored map vs framework :</w:t>
+      </w:r>
+    </w:p>
+    <w:p>
+      <w:pPr>
+        <w:shd w:fill="EAF3E7" w:val="clear"/>
+        <w:spacing w:after="0" w:before="0" w:line="228"/>
+        <w:ind w:left="200"/>
+      </w:pPr>
+      <w:r>
+        <w:rPr>
+          <w:rFonts w:ascii="Consolas" w:cs="Consolas" w:eastAsia="Consolas" w:hAnsi="Consolas"/>
+          <w:sz w:val="17"/>
+          <w:szCs w:val="17"/>
+        </w:rPr>
+        <w:t xml:space="preserve">     exceeds 1e-12 w/h at t = 0.0021 s</w:t>
+      </w:r>
+    </w:p>
+    <w:p>
+      <w:pPr>
+        <w:shd w:fill="EAF3E7" w:val="clear"/>
+        <w:spacing w:after="0" w:before="0" w:line="228"/>
+        <w:ind w:left="200"/>
+      </w:pPr>
+      <w:r>
+        <w:rPr>
+          <w:rFonts w:ascii="Consolas" w:cs="Consolas" w:eastAsia="Consolas" w:hAnsi="Consolas"/>
+          <w:sz w:val="17"/>
+          <w:szCs w:val="17"/>
+        </w:rPr>
+        <w:t xml:space="preserve">     exceeds 1e-3  w/h at t = 1.8740 s</w:t>
+      </w:r>
+    </w:p>
+    <w:p>
+      <w:pPr>
+        <w:shd w:fill="EAF3E7" w:val="clear"/>
+        <w:spacing w:after="0" w:before="0" w:line="228"/>
+        <w:ind w:left="200"/>
+      </w:pPr>
+      <w:r>
+        <w:rPr>
+          <w:rFonts w:ascii="Consolas" w:cs="Consolas" w:eastAsia="Consolas" w:hAnsi="Consolas"/>
+          <w:sz w:val="17"/>
+          <w:szCs w:val="17"/>
+        </w:rPr>
+        <w:t xml:space="preserve">  old code now vs framework :</w:t>
+      </w:r>
+    </w:p>
+    <w:p>
+      <w:pPr>
+        <w:shd w:fill="EAF3E7" w:val="clear"/>
+        <w:spacing w:after="0" w:before="0" w:line="228"/>
+        <w:ind w:left="200"/>
+      </w:pPr>
+      <w:r>
+        <w:rPr>
+          <w:rFonts w:ascii="Consolas" w:cs="Consolas" w:eastAsia="Consolas" w:hAnsi="Consolas"/>
+          <w:sz w:val="17"/>
+          <w:szCs w:val="17"/>
+        </w:rPr>
+        <w:t xml:space="preserve">     exceeds 1e-12 w/h at t = never (identical to this level)</w:t>
+      </w:r>
+    </w:p>
+    <w:p>
+      <w:pPr>
+        <w:shd w:fill="EAF3E7" w:val="clear"/>
+        <w:spacing w:after="0" w:before="0" w:line="228"/>
+        <w:ind w:left="200"/>
+      </w:pPr>
+      <w:r>
+        <w:rPr>
+          <w:rFonts w:ascii="Consolas" w:cs="Consolas" w:eastAsia="Consolas" w:hAnsi="Consolas"/>
+          <w:sz w:val="17"/>
+          <w:szCs w:val="17"/>
+        </w:rPr>
+        <w:t xml:space="preserve"> </w:t>
+      </w:r>
+    </w:p>
+    <w:p>
+      <w:pPr>
+        <w:shd w:fill="EAF3E7" w:val="clear"/>
+        <w:spacing w:after="0" w:before="0" w:line="228"/>
+        <w:ind w:left="200"/>
+      </w:pPr>
+      <w:r>
+        <w:rPr>
+          <w:rFonts w:ascii="Consolas" w:cs="Consolas" w:eastAsia="Consolas" w:hAnsi="Consolas"/>
+          <w:sz w:val="17"/>
+          <w:szCs w:val="17"/>
+        </w:rPr>
+        <w:t xml:space="preserve">  --- had this point settled by t_end? ---</w:t>
+      </w:r>
+    </w:p>
+    <w:p>
+      <w:pPr>
+        <w:shd w:fill="EAF3E7" w:val="clear"/>
+        <w:spacing w:after="0" w:before="0" w:line="228"/>
+        <w:ind w:left="200"/>
+      </w:pPr>
+      <w:r>
+        <w:rPr>
+          <w:rFonts w:ascii="Consolas" w:cs="Consolas" w:eastAsia="Consolas" w:hAnsi="Consolas"/>
+          <w:sz w:val="17"/>
+          <w:szCs w:val="17"/>
+        </w:rPr>
+        <w:t xml:space="preserve">  stored map : LCO          amp first half 2.81 -&gt; last half 2.75 w/h</w:t>
+      </w:r>
+    </w:p>
+    <w:p>
+      <w:pPr>
+        <w:shd w:fill="EAF3E7" w:val="clear"/>
+        <w:spacing w:after="0" w:before="0" w:line="228"/>
+        <w:ind w:left="200"/>
+      </w:pPr>
+      <w:r>
+        <w:rPr>
+          <w:rFonts w:ascii="Consolas" w:cs="Consolas" w:eastAsia="Consolas" w:hAnsi="Consolas"/>
+          <w:sz w:val="17"/>
+          <w:szCs w:val="17"/>
+        </w:rPr>
+        <w:t xml:space="preserve">  framework   : LCO         amp first half 1.02 -&gt; last half 1.96 w/h</w:t>
+      </w:r>
+    </w:p>
+    <w:p>
+      <w:pPr>
+        <w:shd w:fill="EAF3E7" w:val="clear"/>
+        <w:spacing w:after="120" w:before="0" w:line="228"/>
+        <w:ind w:left="200"/>
+      </w:pPr>
+      <w:r>
+        <w:rPr>
+          <w:rFonts w:ascii="Consolas" w:cs="Consolas" w:eastAsia="Consolas" w:hAnsi="Consolas"/>
+          <w:sz w:val="17"/>
+          <w:szCs w:val="17"/>
+        </w:rPr>
+        <w:t xml:space="preserve">               NOT STATIONARY -- this run had not settled by t_end</w:t>
+      </w:r>
+    </w:p>
+    <w:p>
+      <w:pPr>
+        <w:spacing w:after="90" w:line="252"/>
+      </w:pPr>
+      <w:r>
+        <w:rPr>
+          <w:rFonts w:ascii="Calibri" w:cs="Calibri" w:eastAsia="Calibri" w:hAnsi="Calibri"/>
+          <w:sz w:val="21"/>
+          <w:szCs w:val="21"/>
+        </w:rPr>
+        <w:t xml:space="preserve">Read it like this:</w:t>
+      </w:r>
+    </w:p>
+    <w:p>
+      <w:pPr>
+        <w:pStyle w:val="ListParagraph"/>
+        <w:numPr>
+          <w:ilvl w:val="0"/>
+          <w:numId w:val="2"/>
+        </w:numPr>
+        <w:spacing w:after="55" w:line="252"/>
+      </w:pPr>
+      <w:r>
+        <w:rPr>
+          <w:rFonts w:ascii="Calibri" w:cs="Calibri" w:eastAsia="Calibri" w:hAnsi="Calibri"/>
+          <w:sz w:val="21"/>
+          <w:szCs w:val="21"/>
+        </w:rPr>
+        <w:t xml:space="preserve">Separate within the first few steps — a setting differs. Real bug: compare case.json against the old driver line by line.</w:t>
+      </w:r>
+    </w:p>
+    <w:p>
+      <w:pPr>
+        <w:pStyle w:val="ListParagraph"/>
+        <w:numPr>
+          <w:ilvl w:val="0"/>
+          <w:numId w:val="2"/>
+        </w:numPr>
+        <w:spacing w:after="55" w:line="252"/>
+      </w:pPr>
+      <w:r>
+        <w:rPr>
+          <w:rFonts w:ascii="Calibri" w:cs="Calibri" w:eastAsia="Calibri" w:hAnsi="Calibri"/>
+          <w:sz w:val="21"/>
+          <w:szCs w:val="21"/>
+        </w:rPr>
+        <w:t xml:space="preserve">Identical for a while, then diverge — same computation, sensitive point. Check whether the window labels are still changing at the end; if they are, neither answer had converged and the point was a poor regression target.</w:t>
+      </w:r>
+    </w:p>
+    <w:p>
+      <w:pPr>
+        <w:pStyle w:val="ListParagraph"/>
+        <w:numPr>
+          <w:ilvl w:val="0"/>
+          <w:numId w:val="2"/>
+        </w:numPr>
+        <w:spacing w:after="55" w:line="252"/>
+      </w:pPr>
+      <w:r>
+        <w:rPr>
+          <w:rFonts w:ascii="Calibri" w:cs="Calibri" w:eastAsia="Calibri" w:hAnsi="Calibri"/>
+          <w:sz w:val="21"/>
+          <w:szCs w:val="21"/>
+        </w:rPr>
+        <w:t xml:space="preserve">Old code re-run now matches the framework, but neither matches the stored map — the stored numbers came from a different MATLAB or machine. The framework reproduces the old code correctly.</w:t>
+      </w:r>
+    </w:p>
+    <w:p>
+      <w:pPr>
+        <w:spacing w:after="90" w:line="252"/>
+      </w:pPr>
+      <w:r>
+        <w:rPr>
+          <w:rFonts w:ascii="Calibri" w:cs="Calibri" w:eastAsia="Calibri" w:hAnsi="Calibri"/>
+          <w:sz w:val="21"/>
+          <w:szCs w:val="21"/>
+        </w:rPr>
         <w:t xml:space="preserve">To use more points, or to point it at the reference map explicitly:</w:t>
       </w:r>
     </w:p>
@@ -951,22 +1499,22 @@
           <w:sz w:val="17"/>
           <w:szCs w:val="17"/>
         </w:rPr>
-        <w:t xml:space="preserve">&gt;&gt; t03_point_regression(5)</w:t>
-      </w:r>
-    </w:p>
-    <w:p>
-      <w:pPr>
-        <w:shd w:fill="F2F2F2" w:val="clear"/>
-        <w:spacing w:after="0" w:before="0" w:line="228"/>
-        <w:ind w:left="200"/>
-      </w:pPr>
-      <w:r>
-        <w:rPr>
-          <w:rFonts w:ascii="Consolas" w:cs="Consolas" w:eastAsia="Consolas" w:hAnsi="Consolas"/>
-          <w:sz w:val="17"/>
-          <w:szCs w:val="17"/>
-        </w:rPr>
-        <w:t xml:space="preserve">&gt;&gt; t03_point_regression(3, '/Volumes/my_80Gb_box/FTSI/Unheated_FSI_Analysis/case1_run/...</w:t>
+        <w:t xml:space="preserve">&gt;&gt; t03_point_regression(6)</w:t>
+      </w:r>
+    </w:p>
+    <w:p>
+      <w:pPr>
+        <w:shd w:fill="F2F2F2" w:val="clear"/>
+        <w:spacing w:after="0" w:before="0" w:line="228"/>
+        <w:ind w:left="200"/>
+      </w:pPr>
+      <w:r>
+        <w:rPr>
+          <w:rFonts w:ascii="Consolas" w:cs="Consolas" w:eastAsia="Consolas" w:hAnsi="Consolas"/>
+          <w:sz w:val="17"/>
+          <w:szCs w:val="17"/>
+        </w:rPr>
+        <w:t xml:space="preserve">&gt;&gt; t03_point_regression(4, '/Volumes/my_80Gb_box/FTSI/Unheated_FSI_Analysis/case1_run/...</w:t>
       </w:r>
     </w:p>
     <w:p>
@@ -3248,7 +3796,7 @@
                 <w:sz w:val="19"/>
                 <w:szCs w:val="19"/>
               </w:rPr>
-              <w:t xml:space="preserve">A number that used to be hardcoded is being read from the wrong place. The report names the metric, both values, and the operating point. Send it.</w:t>
+              <w:t xml:space="preserve">Run t03b_attribute(pc_kPa, dT_K) on that point — t03 prints the exact command. It says whether a setting drifted (histories separate immediately) or the point is simply sensitive and was never converged (histories agree, then diverge).</w:t>
             </w:r>
           </w:p>
         </w:tc>
@@ -3275,7 +3823,7 @@
                 <w:sz w:val="19"/>
                 <w:szCs w:val="19"/>
               </w:rPr>
-              <w:t xml:space="preserve">Merge says N points MISSING</w:t>
+              <w:t xml:space="preserve">t03 differs only on Amp_wh or Freq at tiny values</w:t>
             </w:r>
           </w:p>
         </w:tc>
@@ -3300,7 +3848,7 @@
                 <w:sz w:val="19"/>
                 <w:szCs w:val="19"/>
               </w:rPr>
-              <w:t xml:space="preserve">Some slices did not finish. Compare the slice numbers, resubmit those, merge again. Merging early is safe.</w:t>
+              <w:t xml:space="preserve">Already handled: values below the physical floor are reported as negligible and not compared. If you see this, you are on an older copy of t03 — re-sync tests/.</w:t>
             </w:r>
           </w:p>
         </w:tc>
@@ -3326,7 +3874,7 @@
                 <w:sz w:val="19"/>
                 <w:szCs w:val="19"/>
               </w:rPr>
-              <w:t xml:space="preserve">MATLAB licence errors during a fan-out</w:t>
+              <w:t xml:space="preserve">Merge says N points MISSING</w:t>
             </w:r>
           </w:p>
         </w:tc>
@@ -3350,7 +3898,7 @@
                 <w:sz w:val="19"/>
                 <w:szCs w:val="19"/>
               </w:rPr>
-              <w:t xml:space="preserve">Too many concurrent MATLAB processes. Resubmit with fewer slices, e.g. 24 instead of 48.</w:t>
+              <w:t xml:space="preserve">Some slices did not finish. Compare the slice numbers, resubmit those, merge again. Merging early is safe.</w:t>
             </w:r>
           </w:p>
         </w:tc>
@@ -3377,7 +3925,7 @@
                 <w:sz w:val="19"/>
                 <w:szCs w:val="19"/>
               </w:rPr>
-              <w:t xml:space="preserve">You want to start a study completely over</w:t>
+              <w:t xml:space="preserve">MATLAB licence errors during a fan-out</w:t>
             </w:r>
           </w:p>
         </w:tc>
@@ -3402,7 +3950,159 @@
                 <w:sz w:val="19"/>
                 <w:szCs w:val="19"/>
               </w:rPr>
+              <w:t xml:space="preserve">Too many concurrent MATLAB processes. Resubmit with fewer slices, e.g. 24 instead of 48.</w:t>
+            </w:r>
+          </w:p>
+        </w:tc>
+      </w:tr>
+      <w:tr>
+        <w:tc>
+          <w:tcPr>
+            <w:tcW w:type="dxa" w:w="3100"/>
+            <w:tcMar>
+              <w:top w:type="dxa" w:w="45"/>
+              <w:left w:type="dxa" w:w="100"/>
+              <w:bottom w:type="dxa" w:w="45"/>
+              <w:right w:type="dxa" w:w="100"/>
+            </w:tcMar>
+          </w:tcPr>
+          <w:p>
+            <w:pPr>
+              <w:spacing w:after="10" w:line="228"/>
+            </w:pPr>
+            <w:r>
+              <w:rPr>
+                <w:rFonts w:ascii="Calibri" w:cs="Calibri" w:eastAsia="Calibri" w:hAnsi="Calibri"/>
+                <w:sz w:val="19"/>
+                <w:szCs w:val="19"/>
+              </w:rPr>
+              <w:t xml:space="preserve">You want to start a study completely over</w:t>
+            </w:r>
+          </w:p>
+        </w:tc>
+        <w:tc>
+          <w:tcPr>
+            <w:tcW w:type="dxa" w:w="6260"/>
+            <w:tcMar>
+              <w:top w:type="dxa" w:w="45"/>
+              <w:left w:type="dxa" w:w="100"/>
+              <w:bottom w:type="dxa" w:w="45"/>
+              <w:right w:type="dxa" w:w="100"/>
+            </w:tcMar>
+          </w:tcPr>
+          <w:p>
+            <w:pPr>
+              <w:spacing w:after="10" w:line="228"/>
+            </w:pPr>
+            <w:r>
+              <w:rPr>
+                <w:rFonts w:ascii="Calibri" w:cs="Calibri" w:eastAsia="Calibri" w:hAnsi="Calibri"/>
+                <w:sz w:val="19"/>
+                <w:szCs w:val="19"/>
+              </w:rPr>
               <w:t xml:space="preserve">Delete results/&lt;case&gt;/&lt;study&gt;/ and run qs_init_study(CASE, STUDY, true). Everything under results/ is reproducible.</w:t>
+            </w:r>
+          </w:p>
+        </w:tc>
+      </w:tr>
+      <w:tr>
+        <w:tc>
+          <w:tcPr>
+            <w:tcW w:type="dxa" w:w="3100"/>
+            <w:shd w:fill="F7F9FC" w:val="clear"/>
+            <w:tcMar>
+              <w:top w:type="dxa" w:w="45"/>
+              <w:left w:type="dxa" w:w="100"/>
+              <w:bottom w:type="dxa" w:w="45"/>
+              <w:right w:type="dxa" w:w="100"/>
+            </w:tcMar>
+          </w:tcPr>
+          <w:p>
+            <w:pPr>
+              <w:spacing w:after="10" w:line="228"/>
+            </w:pPr>
+            <w:r>
+              <w:rPr>
+                <w:rFonts w:ascii="Calibri" w:cs="Calibri" w:eastAsia="Calibri" w:hAnsi="Calibri"/>
+                <w:sz w:val="19"/>
+                <w:szCs w:val="19"/>
+              </w:rPr>
+              <w:t xml:space="preserve">A point reads "static" but is flagged nonstationary</w:t>
+            </w:r>
+          </w:p>
+        </w:tc>
+        <w:tc>
+          <w:tcPr>
+            <w:tcW w:type="dxa" w:w="6260"/>
+            <w:shd w:fill="F7F9FC" w:val="clear"/>
+            <w:tcMar>
+              <w:top w:type="dxa" w:w="45"/>
+              <w:left w:type="dxa" w:w="100"/>
+              <w:bottom w:type="dxa" w:w="45"/>
+              <w:right w:type="dxa" w:w="100"/>
+            </w:tcMar>
+          </w:tcPr>
+          <w:p>
+            <w:pPr>
+              <w:spacing w:after="10" w:line="228"/>
+            </w:pPr>
+            <w:r>
+              <w:rPr>
+                <w:rFonts w:ascii="Calibri" w:cs="Calibri" w:eastAsia="Calibri" w:hAnsi="Calibri"/>
+                <w:sz w:val="19"/>
+                <w:szCs w:val="19"/>
+              </w:rPr>
+              <w:t xml:space="preserve">Check flags.drift_tested. If it is 0 the drift test was skipped because the amplitude is numerical residue, and the static label is solid. If it is 1 the run genuinely had not settled — re-run it longer.</w:t>
+            </w:r>
+          </w:p>
+        </w:tc>
+      </w:tr>
+      <w:tr>
+        <w:tc>
+          <w:tcPr>
+            <w:tcW w:type="dxa" w:w="3100"/>
+            <w:tcMar>
+              <w:top w:type="dxa" w:w="45"/>
+              <w:left w:type="dxa" w:w="100"/>
+              <w:bottom w:type="dxa" w:w="45"/>
+              <w:right w:type="dxa" w:w="100"/>
+            </w:tcMar>
+          </w:tcPr>
+          <w:p>
+            <w:pPr>
+              <w:spacing w:after="10" w:line="228"/>
+            </w:pPr>
+            <w:r>
+              <w:rPr>
+                <w:rFonts w:ascii="Calibri" w:cs="Calibri" w:eastAsia="Calibri" w:hAnsi="Calibri"/>
+                <w:sz w:val="19"/>
+                <w:szCs w:val="19"/>
+              </w:rPr>
+              <w:t xml:space="preserve">The amplitude panel and the label panel seem to disagree</w:t>
+            </w:r>
+          </w:p>
+        </w:tc>
+        <w:tc>
+          <w:tcPr>
+            <w:tcW w:type="dxa" w:w="6260"/>
+            <w:tcMar>
+              <w:top w:type="dxa" w:w="45"/>
+              <w:left w:type="dxa" w:w="100"/>
+              <w:bottom w:type="dxa" w:w="45"/>
+              <w:right w:type="dxa" w:w="100"/>
+            </w:tcMar>
+          </w:tcPr>
+          <w:p>
+            <w:pPr>
+              <w:spacing w:after="10" w:line="228"/>
+            </w:pPr>
+            <w:r>
+              <w:rPr>
+                <w:rFonts w:ascii="Calibri" w:cs="Calibri" w:eastAsia="Calibri" w:hAnsi="Calibri"/>
+                <w:sz w:val="19"/>
+                <w:szCs w:val="19"/>
+              </w:rPr>
+              <w:t xml:space="preserve">They will not any more: the map plots amp_last (last half of the record), which is what the label describes. Amp_wh in the results table covers the whole record and can stay large on a point that oscillated and then died.</w:t>
             </w:r>
           </w:p>
         </w:tc>
@@ -3623,7 +4323,7 @@
                 <w:sz w:val="16"/>
                 <w:szCs w:val="16"/>
               </w:rPr>
-              <w:t xml:space="preserve">run_all_tests([1 2 5])</w:t>
+              <w:t xml:space="preserve">qs_codes</w:t>
             </w:r>
           </w:p>
         </w:tc>
@@ -3647,7 +4347,7 @@
                 <w:sz w:val="19"/>
                 <w:szCs w:val="19"/>
               </w:rPr>
-              <w:t xml:space="preserve">Fast checks, no integration. Run this first, and after any edit to src/.</w:t>
+              <w:t xml:space="preserve">Prints every coded value: labels, flags, metrics, point columns, config names, files, units. Also in docs/CODES.md.</w:t>
             </w:r>
           </w:p>
         </w:tc>
@@ -3674,7 +4374,7 @@
                 <w:sz w:val="16"/>
                 <w:szCs w:val="16"/>
               </w:rPr>
-              <w:t xml:space="preserve">run_all_tests(3)</w:t>
+              <w:t xml:space="preserve">run_all_tests([1 2 5])</w:t>
             </w:r>
           </w:p>
         </w:tc>
@@ -3699,7 +4399,109 @@
                 <w:sz w:val="19"/>
                 <w:szCs w:val="19"/>
               </w:rPr>
+              <w:t xml:space="preserve">Fast checks, no integration. Run this first, and after any edit to src/.</w:t>
+            </w:r>
+          </w:p>
+        </w:tc>
+      </w:tr>
+      <w:tr>
+        <w:tc>
+          <w:tcPr>
+            <w:tcW w:type="dxa" w:w="3200"/>
+            <w:tcMar>
+              <w:top w:type="dxa" w:w="45"/>
+              <w:left w:type="dxa" w:w="100"/>
+              <w:bottom w:type="dxa" w:w="45"/>
+              <w:right w:type="dxa" w:w="100"/>
+            </w:tcMar>
+          </w:tcPr>
+          <w:p>
+            <w:pPr>
+              <w:spacing w:after="10" w:line="228"/>
+            </w:pPr>
+            <w:r>
+              <w:rPr>
+                <w:rFonts w:ascii="Consolas" w:cs="Consolas" w:eastAsia="Consolas" w:hAnsi="Consolas"/>
+                <w:sz w:val="16"/>
+                <w:szCs w:val="16"/>
+              </w:rPr>
+              <w:t xml:space="preserve">run_all_tests(3)</w:t>
+            </w:r>
+          </w:p>
+        </w:tc>
+        <w:tc>
+          <w:tcPr>
+            <w:tcW w:type="dxa" w:w="6160"/>
+            <w:tcMar>
+              <w:top w:type="dxa" w:w="45"/>
+              <w:left w:type="dxa" w:w="100"/>
+              <w:bottom w:type="dxa" w:w="45"/>
+              <w:right w:type="dxa" w:w="100"/>
+            </w:tcMar>
+          </w:tcPr>
+          <w:p>
+            <w:pPr>
+              <w:spacing w:after="10" w:line="228"/>
+            </w:pPr>
+            <w:r>
+              <w:rPr>
+                <w:rFonts w:ascii="Calibri" w:cs="Calibri" w:eastAsia="Calibri" w:hAnsi="Calibri"/>
+                <w:sz w:val="19"/>
+                <w:szCs w:val="19"/>
+              </w:rPr>
               <w:t xml:space="preserve">The numerical regression against the original map.</w:t>
+            </w:r>
+          </w:p>
+        </w:tc>
+      </w:tr>
+      <w:tr>
+        <w:tc>
+          <w:tcPr>
+            <w:tcW w:type="dxa" w:w="3200"/>
+            <w:shd w:fill="F7F9FC" w:val="clear"/>
+            <w:tcMar>
+              <w:top w:type="dxa" w:w="45"/>
+              <w:left w:type="dxa" w:w="100"/>
+              <w:bottom w:type="dxa" w:w="45"/>
+              <w:right w:type="dxa" w:w="100"/>
+            </w:tcMar>
+          </w:tcPr>
+          <w:p>
+            <w:pPr>
+              <w:spacing w:after="10" w:line="228"/>
+            </w:pPr>
+            <w:r>
+              <w:rPr>
+                <w:rFonts w:ascii="Consolas" w:cs="Consolas" w:eastAsia="Consolas" w:hAnsi="Consolas"/>
+                <w:sz w:val="16"/>
+                <w:szCs w:val="16"/>
+              </w:rPr>
+              <w:t xml:space="preserve">t03b_attribute(pc_kPa, dT_K)</w:t>
+            </w:r>
+          </w:p>
+        </w:tc>
+        <w:tc>
+          <w:tcPr>
+            <w:tcW w:type="dxa" w:w="6160"/>
+            <w:shd w:fill="F7F9FC" w:val="clear"/>
+            <w:tcMar>
+              <w:top w:type="dxa" w:w="45"/>
+              <w:left w:type="dxa" w:w="100"/>
+              <w:bottom w:type="dxa" w:w="45"/>
+              <w:right w:type="dxa" w:w="100"/>
+            </w:tcMar>
+          </w:tcPr>
+          <w:p>
+            <w:pPr>
+              <w:spacing w:after="10" w:line="228"/>
+            </w:pPr>
+            <w:r>
+              <w:rPr>
+                <w:rFonts w:ascii="Calibri" w:cs="Calibri" w:eastAsia="Calibri" w:hAnsi="Calibri"/>
+                <w:sz w:val="19"/>
+                <w:szCs w:val="19"/>
+              </w:rPr>
+              <w:t xml:space="preserve">Why one point differs: compares time histories against the stored map and against the old driver re-run now.</w:t>
             </w:r>
           </w:p>
         </w:tc>

</xml_diff>